<commit_message>
Add reliability-section note to cover letter
</commit_message>
<xml_diff>
--- a/manuscript/HSE-FDC_DiscoverSustainability_Cover_Letter.docx
+++ b/manuscript/HSE-FDC_DiscoverSustainability_Cover_Letter.docx
@@ -65,6 +65,11 @@
     <w:p>
       <w:r>
         <w:t>The manuscript is explicit about scope: it does not argue that self-powered architectures are inherently less sustainable than centralized alternatives, nor does it compare against operational strategies such as workload optimization or renewable procurement, which are outside its scope. Its contribution is a general accounting method, demonstrated on one fully worked case study, intended to generalize to other self-powered contexts including remote AI clusters, microgrid-connected facilities, and stranded-energy computing. This revision also states explicitly, in a new Section 3.4 note, the accounting convention used to make fossil and renewable primary-energy comparisons commensurable (the direct/physical-energy-content method), and notes that this is the more conservative choice relative to the paper’s own fossil-unfavorable conclusion.</w:t>
+      </w:r>
+    </w:p>
+    <w:p>
+      <w:r>
+        <w:t>This revision also adds a new Section 5.5, “Reliability advantage of self-powered infrastructure,” to keep the paper’s critical efficiency finding properly balanced. It documents, with recent U.S. grid interruption data and a widely reported 2026 grid-stability incident triggered by a Northern Virginia data-center cluster, that self-powered, off-grid architectures such as HSE-FDC carry no exposure to utility-side outages or transmission-line faults — a genuine benefit that is orthogonal to, and does not offset, the primary-energy-efficiency shortfall this study identifies.</w:t>
       </w:r>
     </w:p>
     <w:p>

</xml_diff>